<commit_message>
Add fellowship call submission + three download cards
</commit_message>
<xml_diff>
--- a/public/docs/CNG_Fellowship_Proposal_v6.docx
+++ b/public/docs/CNG_Fellowship_Proposal_v6.docx
@@ -2,6 +2,179 @@
 <file path=word/document.xml><?xml version="1.0" encoding="utf-8"?>
 <w:document xmlns:wpc="http://schemas.microsoft.com/office/word/2010/wordprocessingCanvas" xmlns:mc="http://schemas.openxmlformats.org/markup-compatibility/2006" xmlns:o="urn:schemas-microsoft-com:office:office" xmlns:r="http://schemas.openxmlformats.org/officeDocument/2006/relationships" xmlns:m="http://schemas.openxmlformats.org/officeDocument/2006/math" xmlns:v="urn:schemas-microsoft-com:vml" xmlns:wp14="http://schemas.microsoft.com/office/word/2010/wordprocessingDrawing" xmlns:wp="http://schemas.openxmlformats.org/drawingml/2006/wordprocessingDrawing" xmlns:w10="urn:schemas-microsoft-com:office:word" xmlns:w="http://schemas.openxmlformats.org/wordprocessingml/2006/main" xmlns:w14="http://schemas.microsoft.com/office/word/2010/wordml" xmlns:w15="http://schemas.microsoft.com/office/word/2012/wordml" xmlns:wpg="http://schemas.microsoft.com/office/word/2010/wordprocessingGroup" xmlns:wpi="http://schemas.microsoft.com/office/word/2010/wordprocessingInk" xmlns:wne="http://schemas.microsoft.com/office/word/2006/wordml" xmlns:wps="http://schemas.microsoft.com/office/word/2010/wordprocessingShape" xmlns:cx="http://schemas.microsoft.com/office/drawing/2014/chartex" xmlns:cx1="http://schemas.microsoft.com/office/drawing/2015/9/8/chartex" xmlns:cx2="http://schemas.microsoft.com/office/drawing/2015/10/21/chartex" xmlns:cx3="http://schemas.microsoft.com/office/drawing/2016/5/9/chartex" xmlns:cx4="http://schemas.microsoft.com/office/drawing/2016/5/10/chartex" xmlns:cx5="http://schemas.microsoft.com/office/drawing/2016/5/11/chartex" xmlns:cx6="http://schemas.microsoft.com/office/drawing/2016/5/12/chartex" xmlns:cx7="http://schemas.microsoft.com/office/drawing/2016/5/13/chartex" xmlns:cx8="http://schemas.microsoft.com/office/drawing/2016/5/14/chartex" xmlns:aink="http://schemas.microsoft.com/office/drawing/2016/ink" xmlns:am3d="http://schemas.microsoft.com/office/drawing/2017/model3d" xmlns:w16cex="http://schemas.microsoft.com/office/word/2018/wordml/cex" xmlns:w16cid="http://schemas.microsoft.com/office/word/2016/wordml/cid" xmlns:w16="http://schemas.microsoft.com/office/word/2018/wordml" xmlns:w16sdtdh="http://schemas.microsoft.com/office/word/2020/wordml/sdtdatahash" xmlns:w16se="http://schemas.microsoft.com/office/word/2015/wordml/symex" mc:Ignorable="w14 w15 wp14">
   <w:body>
+    <w:tbl>
+      <w:tblPr>
+        <w:tblW w:type="dxa" w:w="9360"/>
+        <w:tblBorders>
+          <w:top w:val="single" w:color="auto" w:sz="4"/>
+          <w:left w:val="single" w:color="auto" w:sz="4"/>
+          <w:bottom w:val="single" w:color="auto" w:sz="4"/>
+          <w:right w:val="single" w:color="auto" w:sz="4"/>
+          <w:insideH w:val="single" w:color="auto" w:sz="4"/>
+          <w:insideV w:val="single" w:color="auto" w:sz="4"/>
+        </w:tblBorders>
+      </w:tblPr>
+      <w:tblGrid>
+        <w:gridCol w:w="1080"/>
+        <w:gridCol w:w="7200"/>
+        <w:gridCol w:w="1080"/>
+      </w:tblGrid>
+      <w:tr>
+        <w:tc>
+          <w:tcPr>
+            <w:tcBorders>
+              <w:top w:val="none"/>
+              <w:left w:val="none"/>
+              <w:bottom w:val="none"/>
+              <w:right w:val="none"/>
+            </w:tcBorders>
+            <w:vAlign w:val="center"/>
+          </w:tcPr>
+          <w:p>
+            <w:pPr>
+              <w:spacing w:after="0"/>
+              <w:jc w:val="left"/>
+            </w:pPr>
+            <w:r>
+              <w:drawing>
+                <wp:inline distT="0" distB="0" distL="0" distR="0">
+                  <wp:extent cx="685800" cy="685800"/>
+                  <wp:effectExtent t="0" r="0" b="0" l="0"/>
+                  <wp:docPr id="1" name="" descr="" title=""/>
+                  <wp:cNvGraphicFramePr>
+                    <a:graphicFrameLocks xmlns:a="http://schemas.openxmlformats.org/drawingml/2006/main" noChangeAspect="1"/>
+                  </wp:cNvGraphicFramePr>
+                  <a:graphic xmlns:a="http://schemas.openxmlformats.org/drawingml/2006/main">
+                    <a:graphicData uri="http://schemas.openxmlformats.org/drawingml/2006/picture">
+                      <pic:pic xmlns:pic="http://schemas.openxmlformats.org/drawingml/2006/picture">
+                        <pic:nvPicPr>
+                          <pic:cNvPr id="0" name="" descr=""/>
+                          <pic:cNvPicPr>
+                            <a:picLocks noChangeAspect="1" noChangeArrowheads="1"/>
+                          </pic:cNvPicPr>
+                        </pic:nvPicPr>
+                        <pic:blipFill>
+                          <a:blip r:embed="rId9" cstate="none"/>
+                          <a:srcRect/>
+                          <a:stretch>
+                            <a:fillRect/>
+                          </a:stretch>
+                        </pic:blipFill>
+                        <pic:spPr bwMode="auto">
+                          <a:xfrm>
+                            <a:off x="0" y="0"/>
+                            <a:ext cx="685800" cy="685800"/>
+                          </a:xfrm>
+                          <a:prstGeom prst="rect">
+                            <a:avLst/>
+                          </a:prstGeom>
+                        </pic:spPr>
+                      </pic:pic>
+                    </a:graphicData>
+                  </a:graphic>
+                </wp:inline>
+              </w:drawing>
+            </w:r>
+          </w:p>
+        </w:tc>
+        <w:tc>
+          <w:tcPr>
+            <w:tcBorders>
+              <w:top w:val="none"/>
+              <w:left w:val="none"/>
+              <w:bottom w:val="none"/>
+              <w:right w:val="none"/>
+            </w:tcBorders>
+            <w:vAlign w:val="center"/>
+          </w:tcPr>
+          <w:p>
+            <w:pPr>
+              <w:spacing w:after="0"/>
+              <w:jc w:val="center"/>
+            </w:pPr>
+            <w:r>
+              <w:rPr>
+                <w:rFonts w:ascii="Georgia" w:cs="Georgia" w:eastAsia="Georgia" w:hAnsi="Georgia"/>
+                <w:sz w:val="10"/>
+                <w:szCs w:val="10"/>
+              </w:rPr>
+              <w:t xml:space="preserve"/>
+            </w:r>
+          </w:p>
+        </w:tc>
+        <w:tc>
+          <w:tcPr>
+            <w:tcBorders>
+              <w:top w:val="none"/>
+              <w:left w:val="none"/>
+              <w:bottom w:val="none"/>
+              <w:right w:val="none"/>
+            </w:tcBorders>
+            <w:vAlign w:val="center"/>
+          </w:tcPr>
+          <w:p>
+            <w:pPr>
+              <w:spacing w:after="0"/>
+              <w:jc w:val="right"/>
+            </w:pPr>
+            <w:r>
+              <w:drawing>
+                <wp:inline distT="0" distB="0" distL="0" distR="0">
+                  <wp:extent cx="1047750" cy="219075"/>
+                  <wp:effectExtent t="0" r="0" b="0" l="0"/>
+                  <wp:docPr id="1" name="" descr="" title=""/>
+                  <wp:cNvGraphicFramePr>
+                    <a:graphicFrameLocks xmlns:a="http://schemas.openxmlformats.org/drawingml/2006/main" noChangeAspect="1"/>
+                  </wp:cNvGraphicFramePr>
+                  <a:graphic xmlns:a="http://schemas.openxmlformats.org/drawingml/2006/main">
+                    <a:graphicData uri="http://schemas.openxmlformats.org/drawingml/2006/picture">
+                      <pic:pic xmlns:pic="http://schemas.openxmlformats.org/drawingml/2006/picture">
+                        <pic:nvPicPr>
+                          <pic:cNvPr id="0" name="" descr=""/>
+                          <pic:cNvPicPr>
+                            <a:picLocks noChangeAspect="1" noChangeArrowheads="1"/>
+                          </pic:cNvPicPr>
+                        </pic:nvPicPr>
+                        <pic:blipFill>
+                          <a:blip r:embed="rId10" cstate="none"/>
+                          <a:srcRect/>
+                          <a:stretch>
+                            <a:fillRect/>
+                          </a:stretch>
+                        </pic:blipFill>
+                        <pic:spPr bwMode="auto">
+                          <a:xfrm>
+                            <a:off x="0" y="0"/>
+                            <a:ext cx="1047750" cy="219075"/>
+                          </a:xfrm>
+                          <a:prstGeom prst="rect">
+                            <a:avLst/>
+                          </a:prstGeom>
+                        </pic:spPr>
+                      </pic:pic>
+                    </a:graphicData>
+                  </a:graphic>
+                </wp:inline>
+              </w:drawing>
+            </w:r>
+          </w:p>
+        </w:tc>
+      </w:tr>
+    </w:tbl>
+    <w:p>
+      <w:pPr>
+        <w:keepNext/>
+        <w:spacing w:after="120"/>
+      </w:pPr>
+      <w:r>
+        <w:rPr>
+          <w:rFonts w:ascii="Georgia" w:cs="Georgia" w:eastAsia="Georgia" w:hAnsi="Georgia"/>
+          <w:sz w:val="24"/>
+          <w:szCs w:val="24"/>
+        </w:rPr>
+        <w:t xml:space="preserve"/>
+      </w:r>
+    </w:p>
     <w:tbl>
       <w:tblPr>
         <w:tblW w:type="dxa" w:w="9360"/>
@@ -1367,6 +1540,88 @@
           <w:szCs w:val="22"/>
         </w:rPr>
         <w:t xml:space="preserve">	</w:t>
+      </w:r>
+    </w:p>
+    <w:tbl>
+      <w:tblPr>
+        <w:tblW w:type="dxa" w:w="9360"/>
+        <w:tblBorders>
+          <w:top w:val="single" w:color="auto" w:sz="4"/>
+          <w:left w:val="single" w:color="auto" w:sz="4"/>
+          <w:bottom w:val="single" w:color="auto" w:sz="4"/>
+          <w:right w:val="single" w:color="auto" w:sz="4"/>
+          <w:insideH w:val="single" w:color="auto" w:sz="4"/>
+          <w:insideV w:val="single" w:color="auto" w:sz="4"/>
+        </w:tblBorders>
+      </w:tblPr>
+      <w:tblGrid>
+        <w:gridCol w:w="9360"/>
+      </w:tblGrid>
+      <w:tr>
+        <w:trPr>
+          <w:cantSplit/>
+        </w:trPr>
+        <w:tc>
+          <w:tcPr>
+            <w:tcBorders>
+              <w:top w:val="none" w:color="FFFFFF" w:sz="0"/>
+              <w:left w:val="none" w:color="FFFFFF" w:sz="0"/>
+              <w:bottom w:val="none" w:color="FFFFFF" w:sz="0"/>
+              <w:right w:val="none" w:color="FFFFFF" w:sz="0"/>
+            </w:tcBorders>
+            <w:shd w:fill="F0F4F8" w:val="clear"/>
+            <w:tcMar>
+              <w:top w:type="dxa" w:w="160"/>
+              <w:left w:type="dxa" w:w="300"/>
+              <w:bottom w:type="dxa" w:w="160"/>
+              <w:right w:type="dxa" w:w="300"/>
+            </w:tcMar>
+          </w:tcPr>
+          <w:p>
+            <w:pPr>
+              <w:spacing w:after="100"/>
+            </w:pPr>
+            <w:r>
+              <w:rPr>
+                <w:rFonts w:ascii="Georgia" w:cs="Georgia" w:eastAsia="Georgia" w:hAnsi="Georgia"/>
+                <w:i/>
+                <w:iCs/>
+                <w:color w:val="1B3A5C"/>
+                <w:sz w:val="22"/>
+                <w:szCs w:val="22"/>
+              </w:rPr>
+              <w:t xml:space="preserve">“Artificial intelligence challenges us not to abandon assessment, but to rediscover its human core—dialogue, reasoning, and voice.”</w:t>
+            </w:r>
+          </w:p>
+          <w:p>
+            <w:pPr>
+              <w:spacing w:after="0"/>
+            </w:pPr>
+            <w:r>
+              <w:rPr>
+                <w:rFonts w:ascii="Georgia" w:cs="Georgia" w:eastAsia="Georgia" w:hAnsi="Georgia"/>
+                <w:color w:val="C5DCE4"/>
+                <w:sz w:val="18"/>
+                <w:szCs w:val="18"/>
+              </w:rPr>
+              <w:t xml:space="preserve">— Phillip Dawson, Defending Assessment in the Age of Artificial Intelligence (2021)</w:t>
+            </w:r>
+          </w:p>
+        </w:tc>
+      </w:tr>
+    </w:tbl>
+    <w:p>
+      <w:pPr>
+        <w:keepNext/>
+        <w:spacing w:after="160"/>
+      </w:pPr>
+      <w:r>
+        <w:rPr>
+          <w:rFonts w:ascii="Georgia" w:cs="Georgia" w:eastAsia="Georgia" w:hAnsi="Georgia"/>
+          <w:sz w:val="24"/>
+          <w:szCs w:val="24"/>
+        </w:rPr>
+        <w:t xml:space="preserve"/>
       </w:r>
     </w:p>
     <w:p>
@@ -1518,7 +1773,7 @@
                 <w:sz w:val="24"/>
                 <w:szCs w:val="24"/>
               </w:rPr>
-              <w:t xml:space="preserve">This fellowship develops teacher capacity to design assessments that generate interpretable evidence of student learning in AI-rich classrooms. VISTA (Visibility Into Student Thinking and Agency) is the protocol framework at its core: creating visibility into how students reason, decide, revise, and exercise agency — not just what they produce. Teachers redesign real assessments, enact them with students, collect reasoning evidence, and reflect on practice through two structured iteration cycles.</w:t>
+              <w:t xml:space="preserve">Phillip Dawson argues that AI challenges educators not to abandon assessment, but to rediscover its human core — dialogue, reasoning, voice, and judgment. VISTA operationalises that challenge directly: making those four dimensions visible in every redesigned assessment, so that what teachers evaluate is genuine thinking rather than polished products. VISTA (Visibility Into Student Thinking and Agency) is the protocol framework at the center of this fellowship.</w:t>
             </w:r>
           </w:p>
         </w:tc>
@@ -3432,6 +3687,84 @@
           <w:szCs w:val="26"/>
         </w:rPr>
         <w:t xml:space="preserve">4.1  The Assessment Validity Crisis</w:t>
+      </w:r>
+    </w:p>
+    <w:p>
+      <w:pPr>
+        <w:keepLines/>
+        <w:spacing w:after="160" w:line="280"/>
+      </w:pPr>
+      <w:r>
+        <w:rPr>
+          <w:rFonts w:ascii="Georgia" w:cs="Georgia" w:eastAsia="Georgia" w:hAnsi="Georgia"/>
+          <w:sz w:val="24"/>
+          <w:szCs w:val="24"/>
+        </w:rPr>
+        <w:t xml:space="preserve">Phillip Dawson (2021) argues that AI does not create an assessment crisis — it reveals one that already existed. For decades, </w:t>
+      </w:r>
+      <w:r>
+        <w:rPr>
+          <w:rFonts w:ascii="Georgia" w:cs="Georgia" w:eastAsia="Georgia" w:hAnsi="Georgia"/>
+          <w:b/>
+          <w:bCs/>
+          <w:sz w:val="24"/>
+          <w:szCs w:val="24"/>
+        </w:rPr>
+        <w:t xml:space="preserve">we have mistaken polished products for learning</w:t>
+      </w:r>
+      <w:r>
+        <w:rPr>
+          <w:rFonts w:ascii="Georgia" w:cs="Georgia" w:eastAsia="Georgia" w:hAnsi="Georgia"/>
+          <w:sz w:val="24"/>
+          <w:szCs w:val="24"/>
+        </w:rPr>
+        <w:t xml:space="preserve">, completion for understanding, and performance for reasoning. A finished essay, a solved problem set, a completed lab report: we assumed the product reflected the process. It often did not. AI makes that assumption untenable.</w:t>
+      </w:r>
+    </w:p>
+    <w:p>
+      <w:pPr>
+        <w:keepLines/>
+        <w:spacing w:after="160" w:line="280"/>
+      </w:pPr>
+      <w:r>
+        <w:rPr>
+          <w:rFonts w:ascii="Georgia" w:cs="Georgia" w:eastAsia="Georgia" w:hAnsi="Georgia"/>
+          <w:sz w:val="24"/>
+          <w:szCs w:val="24"/>
+        </w:rPr>
+        <w:t xml:space="preserve">The real problem is that </w:t>
+      </w:r>
+      <w:r>
+        <w:rPr>
+          <w:rFonts w:ascii="Georgia" w:cs="Georgia" w:eastAsia="Georgia" w:hAnsi="Georgia"/>
+          <w:b/>
+          <w:bCs/>
+          <w:sz w:val="24"/>
+          <w:szCs w:val="24"/>
+        </w:rPr>
+        <w:t xml:space="preserve">dialogue, reasoning, voice, and judgment</w:t>
+      </w:r>
+      <w:r>
+        <w:rPr>
+          <w:rFonts w:ascii="Georgia" w:cs="Georgia" w:eastAsia="Georgia" w:hAnsi="Georgia"/>
+          <w:sz w:val="24"/>
+          <w:szCs w:val="24"/>
+        </w:rPr>
+        <w:t xml:space="preserve"> — the human core of learning, in Dawson’s phrase — were already becoming invisible behind finished products. AI simply made that invisibility impossible to ignore. The question this fellowship addresses is not how to protect assessment from AI. It is how to make the human core of learning visible again.</w:t>
+      </w:r>
+    </w:p>
+    <w:p>
+      <w:pPr>
+        <w:keepNext/>
+        <w:spacing w:after="60"/>
+      </w:pPr>
+      <w:r>
+        <w:rPr>
+          <w:rFonts w:ascii="Georgia" w:cs="Georgia" w:eastAsia="Georgia" w:hAnsi="Georgia"/>
+          <w:sz w:val="24"/>
+          <w:szCs w:val="24"/>
+        </w:rPr>
+        <w:t xml:space="preserve"/>
       </w:r>
     </w:p>
     <w:p>
@@ -6330,6 +6663,62 @@
       <w:r>
         <w:rPr>
           <w:rFonts w:ascii="Georgia" w:cs="Georgia" w:eastAsia="Georgia" w:hAnsi="Georgia"/>
+          <w:b/>
+          <w:bCs/>
+          <w:sz w:val="24"/>
+          <w:szCs w:val="24"/>
+        </w:rPr>
+        <w:t xml:space="preserve">Dawson (2021) </w:t>
+      </w:r>
+      <w:r>
+        <w:rPr>
+          <w:rFonts w:ascii="Georgia" w:cs="Georgia" w:eastAsia="Georgia" w:hAnsi="Georgia"/>
+          <w:sz w:val="24"/>
+          <w:szCs w:val="24"/>
+        </w:rPr>
+        <w:t xml:space="preserve">provides the intellectual foundation for this fellowship’s orientation. His argument: AI does not threaten assessment — it exposes how far assessment has drifted from its core purpose. When AI can produce the outputs we evaluate, we are forced to ask what we were actually assessing. His answer is that assessment’s human core consists of </w:t>
+      </w:r>
+      <w:r>
+        <w:rPr>
+          <w:rFonts w:ascii="Georgia" w:cs="Georgia" w:eastAsia="Georgia" w:hAnsi="Georgia"/>
+          <w:b/>
+          <w:bCs/>
+          <w:sz w:val="24"/>
+          <w:szCs w:val="24"/>
+        </w:rPr>
+        <w:t xml:space="preserve">dialogue, reasoning, voice, and judgment</w:t>
+      </w:r>
+      <w:r>
+        <w:rPr>
+          <w:rFonts w:ascii="Georgia" w:cs="Georgia" w:eastAsia="Georgia" w:hAnsi="Georgia"/>
+          <w:sz w:val="24"/>
+          <w:szCs w:val="24"/>
+        </w:rPr>
+        <w:t xml:space="preserve"> — four dimensions this fellowship makes its design target.</w:t>
+      </w:r>
+    </w:p>
+    <w:p>
+      <w:pPr>
+        <w:keepNext/>
+        <w:spacing w:after="60"/>
+      </w:pPr>
+      <w:r>
+        <w:rPr>
+          <w:rFonts w:ascii="Georgia" w:cs="Georgia" w:eastAsia="Georgia" w:hAnsi="Georgia"/>
+          <w:sz w:val="24"/>
+          <w:szCs w:val="24"/>
+        </w:rPr>
+        <w:t xml:space="preserve"/>
+      </w:r>
+    </w:p>
+    <w:p>
+      <w:pPr>
+        <w:keepLines/>
+        <w:spacing w:after="160" w:line="280"/>
+      </w:pPr>
+      <w:r>
+        <w:rPr>
+          <w:rFonts w:ascii="Georgia" w:cs="Georgia" w:eastAsia="Georgia" w:hAnsi="Georgia"/>
           <w:sz w:val="24"/>
           <w:szCs w:val="24"/>
         </w:rPr>
@@ -9786,7 +10175,7 @@
                 <w:sz w:val="24"/>
                 <w:szCs w:val="24"/>
               </w:rPr>
-              <w:t xml:space="preserve">6 High School teachers  ·  Deliberately diverse: AI literacy spectrum, discipline, LC specialist, local and international faculty  ·  One existing assessment audited and iteratively redesigned  ·  Monthly PLC sessions (10 sessions, September–June)  ·  One VSR cycle per teacher  ·  Individual written feedback at each iteration  ·  June Showcase and AI Task Force Handoff Package</w:t>
+              <w:t xml:space="preserve">6 High School teachers  ·  Deliberately diverse: AI literacy spectrum, discipline, LC specialist, local and international faculty  ·  One existing assessment audited and iteratively redesigned  ·  Two PLC sessions  ·  One VSR cycle per teacher  ·  Individual written feedback at each iteration  ·  June Showcase and AI Task Force Handoff Package</w:t>
             </w:r>
           </w:p>
         </w:tc>
@@ -10278,7 +10667,7 @@
           <w:sz w:val="26"/>
           <w:szCs w:val="26"/>
         </w:rPr>
-        <w:t xml:space="preserve">7.5  The AI Stress-Test — Digitising the Coaching Conversation</w:t>
+        <w:t xml:space="preserve">7.5  The Augmented Human Thinking Routine — Digitising the Coaching Conversation</w:t>
       </w:r>
     </w:p>
     <w:p>
@@ -10302,7 +10691,7 @@
           <w:sz w:val="24"/>
           <w:szCs w:val="24"/>
         </w:rPr>
-        <w:t xml:space="preserve">AI Stress-Test</w:t>
+        <w:t xml:space="preserve">Augmented Human Thinking Routine</w:t>
       </w:r>
       <w:r>
         <w:rPr>
@@ -10334,7 +10723,7 @@
           <w:sz w:val="24"/>
           <w:szCs w:val="24"/>
         </w:rPr>
-        <w:t xml:space="preserve">Rather than explaining the Section 5 framework abstractly, the Stress-Test walks teachers through it as four concrete moves on their own task: (1) </w:t>
+        <w:t xml:space="preserve">Rather than explaining the Section 5 framework abstractly, the Augmented Human Thinking Routine walks teachers through it as four concrete moves on their own task: (1) </w:t>
       </w:r>
       <w:r>
         <w:rPr>
@@ -10420,7 +10809,7 @@
           <w:sz w:val="24"/>
           <w:szCs w:val="24"/>
         </w:rPr>
-        <w:t xml:space="preserve">Each move produces a written artifact and ends in a concrete redesign decision. The sequence mirrors a strong coaching conversation — but because the teacher runs it themselves, repeatedly, across both cycles, it develops the independent professional judgment that is the fellowship's core outcome. By Cycle 2, teachers run the Stress-Test on a second assessment with no facilitator involvement. This is how the fellowship turns a coaching relationship into a transferable capacity.</w:t>
+        <w:t xml:space="preserve">Each move produces a written artifact and ends in a concrete redesign decision. The sequence mirrors a strong coaching conversation — but because the teacher runs it themselves, repeatedly, across both cycles, it develops the independent professional judgment that is the fellowship's core outcome. By Cycle 2, teachers run the Augmented Human Thinking Routine on a second assessment with no facilitator involvement. This is how the fellowship turns a coaching relationship into a transferable capacity.</w:t>
       </w:r>
     </w:p>
     <w:p>
@@ -14237,7 +14626,7 @@
           <w:sz w:val="26"/>
           <w:szCs w:val="26"/>
         </w:rPr>
-        <w:t xml:space="preserve">7.6  No-AI Alternatives, Student Choice, and UDL</w:t>
+        <w:t xml:space="preserve">7.6  The Right to Say No — Non-AI Pathways, Student Consent, and Agency</w:t>
       </w:r>
     </w:p>
     <w:p>
@@ -14251,25 +14640,35 @@
           <w:sz w:val="24"/>
           <w:szCs w:val="24"/>
         </w:rPr>
-        <w:t xml:space="preserve">Some students will choose not to use AI for reasons of personal conviction, family values, religious belief, or simply preference. Under Universal Design for Learning principles (CAST, 2018), </w:t>
-      </w:r>
-      <w:r>
-        <w:rPr>
-          <w:rFonts w:ascii="Georgia" w:cs="Georgia" w:eastAsia="Georgia" w:hAnsi="Georgia"/>
-          <w:b/>
-          <w:bCs/>
-          <w:sz w:val="24"/>
-          <w:szCs w:val="24"/>
-        </w:rPr>
-        <w:t xml:space="preserve">this is not an exception to manage — it is a design requirement</w:t>
-      </w:r>
-      <w:r>
-        <w:rPr>
-          <w:rFonts w:ascii="Georgia" w:cs="Georgia" w:eastAsia="Georgia" w:hAnsi="Georgia"/>
-          <w:sz w:val="24"/>
-          <w:szCs w:val="24"/>
-        </w:rPr>
-        <w:t xml:space="preserve">. Every assessment redesigned through the fellowship must include a viable non-AI pathway that meets the same learning goal.</w:t>
+        <w:t xml:space="preserve">This fellowship takes a firm position: </w:t>
+      </w:r>
+      <w:r>
+        <w:rPr>
+          <w:rFonts w:ascii="Georgia" w:cs="Georgia" w:eastAsia="Georgia" w:hAnsi="Georgia"/>
+          <w:b/>
+          <w:bCs/>
+          <w:sz w:val="24"/>
+          <w:szCs w:val="24"/>
+        </w:rPr>
+        <w:t xml:space="preserve">no student should be required to use AI as a condition of participating in learning</w:t>
+      </w:r>
+      <w:r>
+        <w:rPr>
+          <w:rFonts w:ascii="Georgia" w:cs="Georgia" w:eastAsia="Georgia" w:hAnsi="Georgia"/>
+          <w:sz w:val="24"/>
+          <w:szCs w:val="24"/>
+        </w:rPr>
+        <w:t xml:space="preserve">. Students may decline AI use for reasons of personal conviction, family values, religious belief, data privacy concern, or simply preference. These are not exceptions to manage — they are legitimate expressions of student agency. Respecting a student’s right to say no to AI is not a compromise of this fellowship’s goals. </w:t>
+      </w:r>
+      <w:r>
+        <w:rPr>
+          <w:rFonts w:ascii="Georgia" w:cs="Georgia" w:eastAsia="Georgia" w:hAnsi="Georgia"/>
+          <w:b/>
+          <w:bCs/>
+          <w:sz w:val="24"/>
+          <w:szCs w:val="24"/>
+        </w:rPr>
+        <w:t xml:space="preserve">It is one of its clearest expressions.</w:t>
       </w:r>
     </w:p>
     <w:p>
@@ -14283,7 +14682,7 @@
           <w:sz w:val="24"/>
           <w:szCs w:val="24"/>
         </w:rPr>
-        <w:t xml:space="preserve">This is not about creating a two-tier system. A student who completes a task without AI and a student who completes it with AI and documents their reasoning should both be demonstrating the same disciplinary capacity. If the task has been reviewed through VISTA, the task without AI is not harder or easier — it is the original. The task should require genuine thinking whether or not AI is available. If the non-AI version is significantly harder, the AI-assisted version has a design problem.</w:t>
+        <w:t xml:space="preserve">The VISTA audit process makes this practical rather than theoretical. Every assessment redesigned through the fellowship must pass one test: a student who completes the task without AI must be doing the same intellectual work as a student who uses AI deliberately and documents their reasoning. If the non-AI version is significantly harder, the AI-assisted version has a design problem — not a student compliance problem. The task without AI is not the penalty version. It is the original.</w:t>
       </w:r>
     </w:p>
     <w:p>
@@ -14294,22 +14693,139 @@
       <w:r>
         <w:rPr>
           <w:rFonts w:ascii="Georgia" w:cs="Georgia" w:eastAsia="Georgia" w:hAnsi="Georgia"/>
-          <w:sz w:val="24"/>
-          <w:szCs w:val="24"/>
-        </w:rPr>
-        <w:t xml:space="preserve">AI literacy itself can be taught without requiring students to use AI. Teachers can model AI use, share AI outputs for analysis, engage students in evaluating AI-generated work, and discuss the nature and limits of generative AI — all without requiring students to generate AI outputs themselves. UDL principles support multiple means of engagement with the same learning goals. </w:t>
-      </w:r>
-      <w:r>
-        <w:rPr>
-          <w:rFonts w:ascii="Georgia" w:cs="Georgia" w:eastAsia="Georgia" w:hAnsi="Georgia"/>
-          <w:b/>
-          <w:bCs/>
-          <w:sz w:val="24"/>
-          <w:szCs w:val="24"/>
-        </w:rPr>
-        <w:t xml:space="preserve">Respecting student choice about AI is not a compromise of the fellowship’s goals. It is the fellowship’s commitment to human-centered learning made concrete.</w:t>
-      </w:r>
-    </w:p>
+          <w:b/>
+          <w:bCs/>
+          <w:sz w:val="24"/>
+          <w:szCs w:val="24"/>
+        </w:rPr>
+        <w:t xml:space="preserve">The VISTA Paper Audit </w:t>
+      </w:r>
+      <w:r>
+        <w:rPr>
+          <w:rFonts w:ascii="Georgia" w:cs="Georgia" w:eastAsia="Georgia" w:hAnsi="Georgia"/>
+          <w:sz w:val="24"/>
+          <w:szCs w:val="24"/>
+        </w:rPr>
+        <w:t xml:space="preserve">is the fellowship’s concrete instrument for this commitment. It is a printable, bilingual, one-page version of the same six-step VISTA audit — identical questions, identical rating scales, identical SAIL positioning, no browser or AI tool required. A teacher working with a student who declines AI use runs the same audit, makes the same redesign decisions, and collects the same category of reasoning evidence. The research design is not compromised. The student is not disadvantaged. The pathway is genuinely equivalent.</w:t>
+      </w:r>
+    </w:p>
+    <w:p>
+      <w:pPr>
+        <w:keepLines/>
+        <w:spacing w:after="160" w:line="280"/>
+      </w:pPr>
+      <w:r>
+        <w:rPr>
+          <w:rFonts w:ascii="Georgia" w:cs="Georgia" w:eastAsia="Georgia" w:hAnsi="Georgia"/>
+          <w:sz w:val="24"/>
+          <w:szCs w:val="24"/>
+        </w:rPr>
+        <w:t xml:space="preserve">This distinction also has implications for how AI literacy is taught. Students can develop critical understanding of AI — examining outputs, evaluating AI-generated work, discussing the nature and limits of generative systems — without ever being required to produce AI-assisted work themselves. The difference between </w:t>
+      </w:r>
+      <w:r>
+        <w:rPr>
+          <w:rFonts w:ascii="Georgia" w:cs="Georgia" w:eastAsia="Georgia" w:hAnsi="Georgia"/>
+          <w:i/>
+          <w:iCs/>
+          <w:sz w:val="24"/>
+          <w:szCs w:val="24"/>
+        </w:rPr>
+        <w:t xml:space="preserve">understanding AI critically</w:t>
+      </w:r>
+      <w:r>
+        <w:rPr>
+          <w:rFonts w:ascii="Georgia" w:cs="Georgia" w:eastAsia="Georgia" w:hAnsi="Georgia"/>
+          <w:sz w:val="24"/>
+          <w:szCs w:val="24"/>
+        </w:rPr>
+        <w:t xml:space="preserve"> and </w:t>
+      </w:r>
+      <w:r>
+        <w:rPr>
+          <w:rFonts w:ascii="Georgia" w:cs="Georgia" w:eastAsia="Georgia" w:hAnsi="Georgia"/>
+          <w:i/>
+          <w:iCs/>
+          <w:sz w:val="24"/>
+          <w:szCs w:val="24"/>
+        </w:rPr>
+        <w:t xml:space="preserve">using AI to complete tasks</w:t>
+      </w:r>
+      <w:r>
+        <w:rPr>
+          <w:rFonts w:ascii="Georgia" w:cs="Georgia" w:eastAsia="Georgia" w:hAnsi="Georgia"/>
+          <w:sz w:val="24"/>
+          <w:szCs w:val="24"/>
+        </w:rPr>
+        <w:t xml:space="preserve"> is one this fellowship preserves deliberately. It is the difference between education about the world and a mandate to participate in it on terms students did not choose.</w:t>
+      </w:r>
+    </w:p>
+    <w:tbl>
+      <w:tblPr>
+        <w:tblW w:type="dxa" w:w="9360"/>
+        <w:tblBorders>
+          <w:top w:val="single" w:color="auto" w:sz="4"/>
+          <w:left w:val="single" w:color="auto" w:sz="4"/>
+          <w:bottom w:val="single" w:color="auto" w:sz="4"/>
+          <w:right w:val="single" w:color="auto" w:sz="4"/>
+          <w:insideH w:val="single" w:color="auto" w:sz="4"/>
+          <w:insideV w:val="single" w:color="auto" w:sz="4"/>
+        </w:tblBorders>
+      </w:tblPr>
+      <w:tblGrid>
+        <w:gridCol w:w="9360"/>
+      </w:tblGrid>
+      <w:tr>
+        <w:trPr>
+          <w:cantSplit/>
+        </w:trPr>
+        <w:tc>
+          <w:tcPr>
+            <w:tcBorders>
+              <w:top w:val="single" w:color="C9952A" w:sz="12"/>
+              <w:left w:val="none" w:color="FFFFFF" w:sz="0"/>
+              <w:bottom w:val="none" w:color="FFFFFF" w:sz="0"/>
+              <w:right w:val="none" w:color="FFFFFF" w:sz="0"/>
+            </w:tcBorders>
+            <w:shd w:fill="FBF4E8" w:val="clear"/>
+            <w:tcMar>
+              <w:top w:type="dxa" w:w="160"/>
+              <w:left w:type="dxa" w:w="200"/>
+              <w:bottom w:type="dxa" w:w="160"/>
+              <w:right w:type="dxa" w:w="200"/>
+            </w:tcMar>
+          </w:tcPr>
+          <w:p>
+            <w:pPr>
+              <w:spacing w:after="80"/>
+            </w:pPr>
+            <w:r>
+              <w:rPr>
+                <w:rFonts w:ascii="Arial" w:cs="Arial" w:eastAsia="Arial" w:hAnsi="Arial"/>
+                <w:b/>
+                <w:bCs/>
+                <w:color w:val="1B3A5C"/>
+                <w:sz w:val="22"/>
+                <w:szCs w:val="22"/>
+              </w:rPr>
+              <w:t xml:space="preserve">Design Test</w:t>
+            </w:r>
+          </w:p>
+          <w:p>
+            <w:pPr>
+              <w:spacing w:after="0"/>
+            </w:pPr>
+            <w:r>
+              <w:rPr>
+                <w:rFonts w:ascii="Georgia" w:cs="Georgia" w:eastAsia="Georgia" w:hAnsi="Georgia"/>
+                <w:sz w:val="24"/>
+                <w:szCs w:val="24"/>
+              </w:rPr>
+              <w:t xml:space="preserve">If a student says ‘I don’t want to use AI for this’ and the task falls apart — the task was not designed well enough. A well-designed task in this fellowship is one where the answer to that student is: ‘Good. Here is what I need you to show me.’</w:t>
+            </w:r>
+          </w:p>
+        </w:tc>
+      </w:tr>
+    </w:tbl>
     <w:p>
       <w:pPr>
         <w:keepNext/>
@@ -17358,7 +17874,7 @@
           <w:sz w:val="24"/>
           <w:szCs w:val="24"/>
         </w:rPr>
-        <w:t xml:space="preserve">Assessment Audit Toolkit: VISTA Protocol, facilitation guide, discipline-specific examples (</w:t>
+        <w:t xml:space="preserve">Assessment Audit Toolkit: VISTA Protocol (digital and paper), facilitation guide, discipline-specific examples (</w:t>
       </w:r>
       <w:r>
         <w:rPr>
@@ -17377,6 +17893,24 @@
           <w:szCs w:val="24"/>
         </w:rPr>
         <w:t xml:space="preserve">)</w:t>
+      </w:r>
+    </w:p>
+    <w:p>
+      <w:pPr>
+        <w:pStyle w:val="ListParagraph"/>
+        <w:numPr>
+          <w:ilvl w:val="0"/>
+          <w:numId w:val="2"/>
+        </w:numPr>
+        <w:spacing w:after="100"/>
+      </w:pPr>
+      <w:r>
+        <w:rPr>
+          <w:rFonts w:ascii="Georgia" w:cs="Georgia" w:eastAsia="Georgia" w:hAnsi="Georgia"/>
+          <w:sz w:val="24"/>
+          <w:szCs w:val="24"/>
+        </w:rPr>
+        <w:t xml:space="preserve">VISTA Paper Audit: printable, bilingual one-page audit instrument — identical to the digital tool, no browser or AI required. Ensures every teacher and student has a non-AI pathway generating equivalent evidence.</w:t>
       </w:r>
     </w:p>
     <w:p>
@@ -26882,7 +27416,7 @@
           <w:sz w:val="24"/>
           <w:szCs w:val="24"/>
         </w:rPr>
-        <w:t xml:space="preserve">The fellowship works with six High School teachers in three pairs across one year. Pairs are intentional: two experienced AI integrators, two teachers developing their practice, and two skeptical or resistant teachers paired together where they can voice concerns and challenge assumptions without pressure. Each teacher picks one existing assessment, audits it, redesigns it, teaches it, collects student reasoning evidence, and revises. Cajina provides written feedback at each iteration. Monthly lunch PLC sessions (1 hour each, one per month — September through June, 10 sessions total). One VSR session per cycle (two total). One VSR cycle. Under 9 hours across 11 months.</w:t>
+        <w:t xml:space="preserve">The fellowship works with six High School teachers in three pairs across one year. Pairs are intentional: two experienced AI integrators, two teachers developing their practice, and two skeptical or resistant teachers paired together where they can voice concerns and challenge assumptions without pressure. Each teacher picks one existing assessment, audits it, redesigns it, teaches it, collects student reasoning evidence, and revises. Cajina provides written feedback at each iteration. Two monthly lunch PLC sessions (1 hour each). One VSR session per cycle (two total). One VSR cycle. Under 9 hours across 11 months.</w:t>
       </w:r>
     </w:p>
     <w:p>

</xml_diff>